<commit_message>
Fix prospect status: in contract drafting, not signing stage
https://claude.ai/code/session_01HbK9N3vZquubiFb3vE1Zm4
</commit_message>
<xml_diff>
--- a/Informe_Avance_2Q_2026_GVega.docx
+++ b/Informe_Avance_2Q_2026_GVega.docx
@@ -125,7 +125,7 @@
         <w:jc w:val="both"/>
       </w:pPr>
       <w:r>
-        <w:t>Se tienen dos negociaciones formalmente cerradas, pendientes de formalización de contrato al cierre del 2Q, que en conjunto representan el 155% de la meta trimestral de superficie (344 m² vs 222 m²).</w:t>
+        <w:t>Se tienen dos negociaciones formalmente cerradas, con contratos en proceso de elaboración al cierre del 2Q, que en conjunto representan el 155% de la meta trimestral de superficie (344 m² vs 222 m²).</w:t>
       </w:r>
     </w:p>
     <w:tbl>
@@ -1177,7 +1177,7 @@
                 <w:b w:val="0"/>
                 <w:sz w:val="20"/>
               </w:rPr>
-              <w:t>En formalización</w:t>
+              <w:t>En elaboración de contrato</w:t>
             </w:r>
           </w:p>
         </w:tc>

</xml_diff>

<commit_message>
Actualiza Objetivo 2 en informe 2Q con hallazgos del diagnóstico energético
Sustituye 'Sin avance' por el diagnóstico global concluido:
- 53 arrendatarios analizados (31 locales, 22 antenas, 29 propiedades)
- 25 independizados (47.2%) / 28 pendientes de acción (52.8%)
- Barras de progreso por categoría y tabla de hoteles prioritarios
- Badge actualizado a 'Diagnóstico realizado'
- PDF y Word regenerados con el nuevo contenido
</commit_message>
<xml_diff>
--- a/Informe_Avance_2Q_2026_GVega.docx
+++ b/Informe_Avance_2Q_2026_GVega.docx
@@ -810,10 +810,11 @@
     <w:p>
       <w:r>
         <w:rPr>
-          <w:color w:val="7A92A8"/>
+          <w:b/>
+          <w:color w:val="B8943A"/>
           <w:sz w:val="20"/>
         </w:rPr>
-        <w:t>Ponderación: 25%  ·  Sin avance en 2Q</w:t>
+        <w:t>Ponderación: 25%  ·  Diagnóstico global concluido en 2Q  ·  53 arrendatarios analizados</w:t>
       </w:r>
     </w:p>
     <w:p>
@@ -821,9 +822,674 @@
         <w:jc w:val="both"/>
       </w:pPr>
       <w:r>
-        <w:t>El objetivo no registra avance cuantificable en el 2Q. Su ejecución depende de la conclusión del diagnóstico global de infraestructura eléctrica e hídrica de cada hotel, el cual permanece pendiente.</w:t>
+        <w:t>Durante el 2Q se concluyó el diagnóstico global de infraestructura eléctrica e hídrica de los arrendatarios del portafolio. Se analizaron 53 arrendatarios (31 locales y 22 antenas) distribuidos en 29 propiedades, identificando en cada caso el estatus de independización de luz y agua respecto al sistema del hotel. Este diagnóstico constituye el insumo base para la ejecución de las acciones de independización en los trimestres subsecuentes.</w:t>
       </w:r>
     </w:p>
+    <w:p>
+      <w:r>
+        <w:rPr>
+          <w:b/>
+          <w:color w:val="0C2340"/>
+          <w:sz w:val="22"/>
+        </w:rPr>
+        <w:t>Indicadores del Diagnóstico</w:t>
+      </w:r>
+    </w:p>
+    <w:tbl>
+      <w:tblPr>
+        <w:tblStyle w:val="TableGrid"/>
+        <w:tblW w:type="auto" w:w="0"/>
+        <w:tblLook w:firstColumn="1" w:firstRow="1" w:lastColumn="0" w:lastRow="0" w:noHBand="0" w:noVBand="1" w:val="04A0"/>
+      </w:tblPr>
+      <w:tblGrid>
+        <w:gridCol w:w="3135"/>
+        <w:gridCol w:w="3135"/>
+        <w:gridCol w:w="3135"/>
+      </w:tblGrid>
+      <w:tr>
+        <w:tc>
+          <w:tcPr>
+            <w:tcW w:type="dxa" w:w="3135"/>
+            <w:shd w:val="clear" w:color="auto" w:fill="0C2340"/>
+          </w:tcPr>
+          <w:p>
+            <w:r>
+              <w:rPr>
+                <w:b/>
+                <w:color w:val="FFFFFF"/>
+                <w:sz w:val="20"/>
+              </w:rPr>
+              <w:t>Categoría</w:t>
+            </w:r>
+          </w:p>
+        </w:tc>
+        <w:tc>
+          <w:tcPr>
+            <w:tcW w:type="dxa" w:w="3135"/>
+            <w:shd w:val="clear" w:color="auto" w:fill="0C2340"/>
+          </w:tcPr>
+          <w:p>
+            <w:r>
+              <w:rPr>
+                <w:b/>
+                <w:color w:val="FFFFFF"/>
+                <w:sz w:val="20"/>
+              </w:rPr>
+              <w:t>Independizados</w:t>
+            </w:r>
+          </w:p>
+        </w:tc>
+        <w:tc>
+          <w:tcPr>
+            <w:tcW w:type="dxa" w:w="3135"/>
+            <w:shd w:val="clear" w:color="auto" w:fill="0C2340"/>
+          </w:tcPr>
+          <w:p>
+            <w:r>
+              <w:rPr>
+                <w:b/>
+                <w:color w:val="FFFFFF"/>
+                <w:sz w:val="20"/>
+              </w:rPr>
+              <w:t>Dependientes del hotel</w:t>
+            </w:r>
+          </w:p>
+        </w:tc>
+      </w:tr>
+      <w:tr>
+        <w:tc>
+          <w:tcPr>
+            <w:tcW w:type="dxa" w:w="3135"/>
+            <w:shd w:val="clear" w:color="auto" w:fill="FFFFFF"/>
+          </w:tcPr>
+          <w:p>
+            <w:r>
+              <w:rPr>
+                <w:b w:val="0"/>
+                <w:sz w:val="20"/>
+              </w:rPr>
+              <w:t>Locales comerciales (31 total)</w:t>
+            </w:r>
+          </w:p>
+        </w:tc>
+        <w:tc>
+          <w:tcPr>
+            <w:tcW w:type="dxa" w:w="3135"/>
+            <w:shd w:val="clear" w:color="auto" w:fill="FFFFFF"/>
+          </w:tcPr>
+          <w:p>
+            <w:r>
+              <w:rPr>
+                <w:b w:val="0"/>
+                <w:sz w:val="20"/>
+              </w:rPr>
+              <w:t>13  —  41.9%</w:t>
+            </w:r>
+          </w:p>
+        </w:tc>
+        <w:tc>
+          <w:tcPr>
+            <w:tcW w:type="dxa" w:w="3135"/>
+            <w:shd w:val="clear" w:color="auto" w:fill="FFFFFF"/>
+          </w:tcPr>
+          <w:p>
+            <w:r>
+              <w:rPr>
+                <w:b w:val="0"/>
+                <w:sz w:val="20"/>
+              </w:rPr>
+              <w:t>18  —  58.1%</w:t>
+            </w:r>
+          </w:p>
+        </w:tc>
+      </w:tr>
+      <w:tr>
+        <w:tc>
+          <w:tcPr>
+            <w:tcW w:type="dxa" w:w="3135"/>
+            <w:shd w:val="clear" w:color="auto" w:fill="EBF0F6"/>
+          </w:tcPr>
+          <w:p>
+            <w:r>
+              <w:rPr>
+                <w:b w:val="0"/>
+                <w:sz w:val="20"/>
+              </w:rPr>
+              <w:t>Antenas (22 total)</w:t>
+            </w:r>
+          </w:p>
+        </w:tc>
+        <w:tc>
+          <w:tcPr>
+            <w:tcW w:type="dxa" w:w="3135"/>
+            <w:shd w:val="clear" w:color="auto" w:fill="EBF0F6"/>
+          </w:tcPr>
+          <w:p>
+            <w:r>
+              <w:rPr>
+                <w:b w:val="0"/>
+                <w:sz w:val="20"/>
+              </w:rPr>
+              <w:t>12  —  54.5%</w:t>
+            </w:r>
+          </w:p>
+        </w:tc>
+        <w:tc>
+          <w:tcPr>
+            <w:tcW w:type="dxa" w:w="3135"/>
+            <w:shd w:val="clear" w:color="auto" w:fill="EBF0F6"/>
+          </w:tcPr>
+          <w:p>
+            <w:r>
+              <w:rPr>
+                <w:b w:val="0"/>
+                <w:sz w:val="20"/>
+              </w:rPr>
+              <w:t>10  —  45.5%</w:t>
+            </w:r>
+          </w:p>
+        </w:tc>
+      </w:tr>
+      <w:tr>
+        <w:tc>
+          <w:tcPr>
+            <w:tcW w:type="dxa" w:w="3135"/>
+            <w:shd w:val="clear" w:color="auto" w:fill="1A3A5C"/>
+          </w:tcPr>
+          <w:p>
+            <w:r>
+              <w:rPr>
+                <w:b/>
+                <w:color w:val="FFFFFF"/>
+                <w:sz w:val="20"/>
+              </w:rPr>
+              <w:t>Total arrendatarios (53)</w:t>
+            </w:r>
+          </w:p>
+        </w:tc>
+        <w:tc>
+          <w:tcPr>
+            <w:tcW w:type="dxa" w:w="3135"/>
+            <w:shd w:val="clear" w:color="auto" w:fill="1A3A5C"/>
+          </w:tcPr>
+          <w:p>
+            <w:r>
+              <w:rPr>
+                <w:b/>
+                <w:color w:val="FFFFFF"/>
+                <w:sz w:val="20"/>
+              </w:rPr>
+              <w:t>25  —  47.2%</w:t>
+            </w:r>
+          </w:p>
+        </w:tc>
+        <w:tc>
+          <w:tcPr>
+            <w:tcW w:type="dxa" w:w="3135"/>
+            <w:shd w:val="clear" w:color="auto" w:fill="1A3A5C"/>
+          </w:tcPr>
+          <w:p>
+            <w:r>
+              <w:rPr>
+                <w:b/>
+                <w:color w:val="FFFFFF"/>
+                <w:sz w:val="20"/>
+              </w:rPr>
+              <w:t>28  —  52.8%</w:t>
+            </w:r>
+          </w:p>
+        </w:tc>
+      </w:tr>
+      <w:tr>
+        <w:tc>
+          <w:tcPr>
+            <w:tcW w:type="dxa" w:w="3135"/>
+            <w:shd w:val="clear" w:color="auto" w:fill="E6F4EE"/>
+          </w:tcPr>
+          <w:p>
+            <w:r>
+              <w:rPr>
+                <w:b w:val="0"/>
+                <w:sz w:val="20"/>
+              </w:rPr>
+              <w:t>Diagnóstico global de infraestructura</w:t>
+            </w:r>
+          </w:p>
+        </w:tc>
+        <w:tc>
+          <w:tcPr>
+            <w:tcW w:type="dxa" w:w="3135"/>
+            <w:shd w:val="clear" w:color="auto" w:fill="E6F4EE"/>
+          </w:tcPr>
+          <w:p>
+            <w:r>
+              <w:rPr>
+                <w:b w:val="0"/>
+                <w:sz w:val="20"/>
+              </w:rPr>
+              <w:t>Concluido  ✓</w:t>
+            </w:r>
+          </w:p>
+        </w:tc>
+        <w:tc>
+          <w:tcPr>
+            <w:tcW w:type="dxa" w:w="3135"/>
+            <w:shd w:val="clear" w:color="auto" w:fill="E6F4EE"/>
+          </w:tcPr>
+          <w:p>
+            <w:r>
+              <w:rPr>
+                <w:b w:val="0"/>
+                <w:sz w:val="20"/>
+              </w:rPr>
+              <w:t>—</w:t>
+            </w:r>
+          </w:p>
+        </w:tc>
+      </w:tr>
+    </w:tbl>
+    <w:p/>
+    <w:p>
+      <w:r>
+        <w:rPr>
+          <w:b/>
+          <w:color w:val="0C2340"/>
+          <w:sz w:val="22"/>
+        </w:rPr>
+        <w:t>Hoteles prioritarios para independización</w:t>
+      </w:r>
+    </w:p>
+    <w:tbl>
+      <w:tblPr>
+        <w:tblStyle w:val="TableGrid"/>
+        <w:tblW w:type="auto" w:w="0"/>
+        <w:tblLook w:firstColumn="1" w:firstRow="1" w:lastColumn="0" w:lastRow="0" w:noHBand="0" w:noVBand="1" w:val="04A0"/>
+      </w:tblPr>
+      <w:tblGrid>
+        <w:gridCol w:w="3135"/>
+        <w:gridCol w:w="3135"/>
+        <w:gridCol w:w="3135"/>
+      </w:tblGrid>
+      <w:tr>
+        <w:tc>
+          <w:tcPr>
+            <w:tcW w:type="dxa" w:w="3135"/>
+            <w:shd w:val="clear" w:color="auto" w:fill="0C2340"/>
+          </w:tcPr>
+          <w:p>
+            <w:r>
+              <w:rPr>
+                <w:b/>
+                <w:color w:val="FFFFFF"/>
+                <w:sz w:val="20"/>
+              </w:rPr>
+              <w:t>Hotel</w:t>
+            </w:r>
+          </w:p>
+        </w:tc>
+        <w:tc>
+          <w:tcPr>
+            <w:tcW w:type="dxa" w:w="3135"/>
+            <w:shd w:val="clear" w:color="auto" w:fill="0C2340"/>
+          </w:tcPr>
+          <w:p>
+            <w:r>
+              <w:rPr>
+                <w:b/>
+                <w:color w:val="FFFFFF"/>
+                <w:sz w:val="20"/>
+              </w:rPr>
+              <w:t>Locales pendientes</w:t>
+            </w:r>
+          </w:p>
+        </w:tc>
+        <w:tc>
+          <w:tcPr>
+            <w:tcW w:type="dxa" w:w="3135"/>
+            <w:shd w:val="clear" w:color="auto" w:fill="0C2340"/>
+          </w:tcPr>
+          <w:p>
+            <w:r>
+              <w:rPr>
+                <w:b/>
+                <w:color w:val="FFFFFF"/>
+                <w:sz w:val="20"/>
+              </w:rPr>
+              <w:t>Tipo de dependencia</w:t>
+            </w:r>
+          </w:p>
+        </w:tc>
+      </w:tr>
+      <w:tr>
+        <w:tc>
+          <w:tcPr>
+            <w:tcW w:type="dxa" w:w="3135"/>
+            <w:shd w:val="clear" w:color="auto" w:fill="FFFFFF"/>
+          </w:tcPr>
+          <w:p>
+            <w:r>
+              <w:rPr>
+                <w:b w:val="0"/>
+                <w:sz w:val="20"/>
+              </w:rPr>
+              <w:t>Wyndham Ambassador Monterrey Centro</w:t>
+            </w:r>
+          </w:p>
+        </w:tc>
+        <w:tc>
+          <w:tcPr>
+            <w:tcW w:type="dxa" w:w="3135"/>
+            <w:shd w:val="clear" w:color="auto" w:fill="FFFFFF"/>
+          </w:tcPr>
+          <w:p>
+            <w:r>
+              <w:rPr>
+                <w:b w:val="0"/>
+                <w:sz w:val="20"/>
+              </w:rPr>
+              <w:t>6 locales</w:t>
+            </w:r>
+          </w:p>
+        </w:tc>
+        <w:tc>
+          <w:tcPr>
+            <w:tcW w:type="dxa" w:w="3135"/>
+            <w:shd w:val="clear" w:color="auto" w:fill="FFFFFF"/>
+          </w:tcPr>
+          <w:p>
+            <w:r>
+              <w:rPr>
+                <w:b w:val="0"/>
+                <w:sz w:val="20"/>
+              </w:rPr>
+              <w:t>Luz y agua</w:t>
+            </w:r>
+          </w:p>
+        </w:tc>
+      </w:tr>
+      <w:tr>
+        <w:tc>
+          <w:tcPr>
+            <w:tcW w:type="dxa" w:w="3135"/>
+            <w:shd w:val="clear" w:color="auto" w:fill="EBF0F6"/>
+          </w:tcPr>
+          <w:p>
+            <w:r>
+              <w:rPr>
+                <w:b w:val="0"/>
+                <w:sz w:val="20"/>
+              </w:rPr>
+              <w:t>Gamma Tijuana Otay</w:t>
+            </w:r>
+          </w:p>
+        </w:tc>
+        <w:tc>
+          <w:tcPr>
+            <w:tcW w:type="dxa" w:w="3135"/>
+            <w:shd w:val="clear" w:color="auto" w:fill="EBF0F6"/>
+          </w:tcPr>
+          <w:p>
+            <w:r>
+              <w:rPr>
+                <w:b w:val="0"/>
+                <w:sz w:val="20"/>
+              </w:rPr>
+              <w:t>3 locales</w:t>
+            </w:r>
+          </w:p>
+        </w:tc>
+        <w:tc>
+          <w:tcPr>
+            <w:tcW w:type="dxa" w:w="3135"/>
+            <w:shd w:val="clear" w:color="auto" w:fill="EBF0F6"/>
+          </w:tcPr>
+          <w:p>
+            <w:r>
+              <w:rPr>
+                <w:b w:val="0"/>
+                <w:sz w:val="20"/>
+              </w:rPr>
+              <w:t>Luz y agua</w:t>
+            </w:r>
+          </w:p>
+        </w:tc>
+      </w:tr>
+      <w:tr>
+        <w:tc>
+          <w:tcPr>
+            <w:tcW w:type="dxa" w:w="3135"/>
+            <w:shd w:val="clear" w:color="auto" w:fill="FFFFFF"/>
+          </w:tcPr>
+          <w:p>
+            <w:r>
+              <w:rPr>
+                <w:b w:val="0"/>
+                <w:sz w:val="20"/>
+              </w:rPr>
+              <w:t>Fiesta Americana Condesa Cancún</w:t>
+            </w:r>
+          </w:p>
+        </w:tc>
+        <w:tc>
+          <w:tcPr>
+            <w:tcW w:type="dxa" w:w="3135"/>
+            <w:shd w:val="clear" w:color="auto" w:fill="FFFFFF"/>
+          </w:tcPr>
+          <w:p>
+            <w:r>
+              <w:rPr>
+                <w:b w:val="0"/>
+                <w:sz w:val="20"/>
+              </w:rPr>
+              <w:t>2 locales</w:t>
+            </w:r>
+          </w:p>
+        </w:tc>
+        <w:tc>
+          <w:tcPr>
+            <w:tcW w:type="dxa" w:w="3135"/>
+            <w:shd w:val="clear" w:color="auto" w:fill="FFFFFF"/>
+          </w:tcPr>
+          <w:p>
+            <w:r>
+              <w:rPr>
+                <w:b w:val="0"/>
+                <w:sz w:val="20"/>
+              </w:rPr>
+              <w:t>Luz y agua (acuerdo contractual)</w:t>
+            </w:r>
+          </w:p>
+        </w:tc>
+      </w:tr>
+      <w:tr>
+        <w:tc>
+          <w:tcPr>
+            <w:tcW w:type="dxa" w:w="3135"/>
+            <w:shd w:val="clear" w:color="auto" w:fill="EBF0F6"/>
+          </w:tcPr>
+          <w:p>
+            <w:r>
+              <w:rPr>
+                <w:b w:val="0"/>
+                <w:sz w:val="20"/>
+              </w:rPr>
+              <w:t>One Monterrey Aeropuerto</w:t>
+            </w:r>
+          </w:p>
+        </w:tc>
+        <w:tc>
+          <w:tcPr>
+            <w:tcW w:type="dxa" w:w="3135"/>
+            <w:shd w:val="clear" w:color="auto" w:fill="EBF0F6"/>
+          </w:tcPr>
+          <w:p>
+            <w:r>
+              <w:rPr>
+                <w:b w:val="0"/>
+                <w:sz w:val="20"/>
+              </w:rPr>
+              <w:t>2 locales</w:t>
+            </w:r>
+          </w:p>
+        </w:tc>
+        <w:tc>
+          <w:tcPr>
+            <w:tcW w:type="dxa" w:w="3135"/>
+            <w:shd w:val="clear" w:color="auto" w:fill="EBF0F6"/>
+          </w:tcPr>
+          <w:p>
+            <w:r>
+              <w:rPr>
+                <w:b w:val="0"/>
+                <w:sz w:val="20"/>
+              </w:rPr>
+              <w:t>Solo agua</w:t>
+            </w:r>
+          </w:p>
+        </w:tc>
+      </w:tr>
+      <w:tr>
+        <w:tc>
+          <w:tcPr>
+            <w:tcW w:type="dxa" w:w="3135"/>
+            <w:shd w:val="clear" w:color="auto" w:fill="FFFFFF"/>
+          </w:tcPr>
+          <w:p>
+            <w:r>
+              <w:rPr>
+                <w:b w:val="0"/>
+                <w:sz w:val="20"/>
+              </w:rPr>
+              <w:t>Fiesta Americana Hermosillo</w:t>
+            </w:r>
+          </w:p>
+        </w:tc>
+        <w:tc>
+          <w:tcPr>
+            <w:tcW w:type="dxa" w:w="3135"/>
+            <w:shd w:val="clear" w:color="auto" w:fill="FFFFFF"/>
+          </w:tcPr>
+          <w:p>
+            <w:r>
+              <w:rPr>
+                <w:b w:val="0"/>
+                <w:sz w:val="20"/>
+              </w:rPr>
+              <w:t>1 local</w:t>
+            </w:r>
+          </w:p>
+        </w:tc>
+        <w:tc>
+          <w:tcPr>
+            <w:tcW w:type="dxa" w:w="3135"/>
+            <w:shd w:val="clear" w:color="auto" w:fill="FFFFFF"/>
+          </w:tcPr>
+          <w:p>
+            <w:r>
+              <w:rPr>
+                <w:b w:val="0"/>
+                <w:sz w:val="20"/>
+              </w:rPr>
+              <w:t>Luz y agua</w:t>
+            </w:r>
+          </w:p>
+        </w:tc>
+      </w:tr>
+      <w:tr>
+        <w:tc>
+          <w:tcPr>
+            <w:tcW w:type="dxa" w:w="3135"/>
+            <w:shd w:val="clear" w:color="auto" w:fill="EBF0F6"/>
+          </w:tcPr>
+          <w:p>
+            <w:r>
+              <w:rPr>
+                <w:b w:val="0"/>
+                <w:sz w:val="20"/>
+              </w:rPr>
+              <w:t>Fiesta Inn Ciudad Juárez</w:t>
+            </w:r>
+          </w:p>
+        </w:tc>
+        <w:tc>
+          <w:tcPr>
+            <w:tcW w:type="dxa" w:w="3135"/>
+            <w:shd w:val="clear" w:color="auto" w:fill="EBF0F6"/>
+          </w:tcPr>
+          <w:p>
+            <w:r>
+              <w:rPr>
+                <w:b w:val="0"/>
+                <w:sz w:val="20"/>
+              </w:rPr>
+              <w:t>1 local</w:t>
+            </w:r>
+          </w:p>
+        </w:tc>
+        <w:tc>
+          <w:tcPr>
+            <w:tcW w:type="dxa" w:w="3135"/>
+            <w:shd w:val="clear" w:color="auto" w:fill="EBF0F6"/>
+          </w:tcPr>
+          <w:p>
+            <w:r>
+              <w:rPr>
+                <w:b w:val="0"/>
+                <w:sz w:val="20"/>
+              </w:rPr>
+              <w:t>Solo electricidad</w:t>
+            </w:r>
+          </w:p>
+        </w:tc>
+      </w:tr>
+      <w:tr>
+        <w:tc>
+          <w:tcPr>
+            <w:tcW w:type="dxa" w:w="3135"/>
+            <w:shd w:val="clear" w:color="auto" w:fill="FFFFFF"/>
+          </w:tcPr>
+          <w:p>
+            <w:r>
+              <w:rPr>
+                <w:b w:val="0"/>
+                <w:sz w:val="20"/>
+              </w:rPr>
+              <w:t>Fiesta Inn Ciudad Obregón</w:t>
+            </w:r>
+          </w:p>
+        </w:tc>
+        <w:tc>
+          <w:tcPr>
+            <w:tcW w:type="dxa" w:w="3135"/>
+            <w:shd w:val="clear" w:color="auto" w:fill="FFFFFF"/>
+          </w:tcPr>
+          <w:p>
+            <w:r>
+              <w:rPr>
+                <w:b w:val="0"/>
+                <w:sz w:val="20"/>
+              </w:rPr>
+              <w:t>1 local</w:t>
+            </w:r>
+          </w:p>
+        </w:tc>
+        <w:tc>
+          <w:tcPr>
+            <w:tcW w:type="dxa" w:w="3135"/>
+            <w:shd w:val="clear" w:color="auto" w:fill="FFFFFF"/>
+          </w:tcPr>
+          <w:p>
+            <w:r>
+              <w:rPr>
+                <w:b w:val="0"/>
+                <w:sz w:val="20"/>
+              </w:rPr>
+              <w:t>Solo electricidad</w:t>
+            </w:r>
+          </w:p>
+        </w:tc>
+      </w:tr>
+    </w:tbl>
     <w:p/>
     <w:p>
       <w:r>
@@ -1224,7 +1890,7 @@
                 <w:b w:val="0"/>
                 <w:sz w:val="20"/>
               </w:rPr>
-              <w:t>Pendiente diagnóstico de infraestructura</w:t>
+              <w:t>Diagnóstico concluido: 53 arrendat., 47.2% independiz.</w:t>
             </w:r>
           </w:p>
         </w:tc>
@@ -1239,7 +1905,7 @@
                 <w:b w:val="0"/>
                 <w:sz w:val="20"/>
               </w:rPr>
-              <w:t>Sin avance</w:t>
+              <w:t>Diagnóstico realizado</w:t>
             </w:r>
           </w:p>
         </w:tc>

</xml_diff>